<commit_message>
cvs and games/minor tweaks
</commit_message>
<xml_diff>
--- a/downloads/cvs/DOCX/Arron Ware CV AV Broadcast Technician Mar26 .docx
+++ b/downloads/cvs/DOCX/Arron Ware CV AV Broadcast Technician Mar26 .docx
@@ -574,42 +574,7 @@
           <w:b/>
           <w:bCs/>
         </w:rPr>
-        <w:t xml:space="preserve"> </w:t>
-      </w:r>
-      <w:r>
-        <w:rPr>
-          <w:b/>
-          <w:bCs/>
-        </w:rPr>
-        <w:t>Technical</w:t>
-      </w:r>
-      <w:r>
-        <w:rPr>
-          <w:b/>
-          <w:bCs/>
-        </w:rPr>
-        <w:t xml:space="preserve"> Operator </w:t>
-      </w:r>
-      <w:r>
-        <w:rPr>
-          <w:b/>
-          <w:bCs/>
-        </w:rPr>
-        <w:t>(Internship)</w:t>
-      </w:r>
-      <w:r>
-        <w:rPr>
-          <w:b/>
-          <w:bCs/>
-        </w:rPr>
-        <w:t xml:space="preserve"> – </w:t>
-      </w:r>
-      <w:r>
-        <w:rPr>
-          <w:b/>
-          <w:bCs/>
-        </w:rPr>
-        <w:t>Wavecast</w:t>
+        <w:t xml:space="preserve"> Technical Operator (Internship) – Wavecast</w:t>
       </w:r>
     </w:p>
     <w:p>
@@ -887,52 +852,7 @@
           <w:kern w:val="0"/>
           <w14:ligatures w14:val="none"/>
         </w:rPr>
-        <w:t>O</w:t>
-      </w:r>
-      <w:r>
-        <w:rPr>
-          <w:rFonts w:eastAsia="Times New Roman"/>
-          <w:color w:val="auto"/>
-          <w:kern w:val="0"/>
-          <w14:ligatures w14:val="none"/>
-        </w:rPr>
-        <w:t xml:space="preserve">ver 4 years of continuous experience using </w:t>
-      </w:r>
-      <w:r>
-        <w:rPr>
-          <w:rFonts w:eastAsia="Times New Roman"/>
-          <w:color w:val="auto"/>
-          <w:kern w:val="0"/>
-          <w14:ligatures w14:val="none"/>
-        </w:rPr>
-        <w:t>AV</w:t>
-      </w:r>
-      <w:r>
-        <w:rPr>
-          <w:rFonts w:eastAsia="Times New Roman"/>
-          <w:color w:val="auto"/>
-          <w:kern w:val="0"/>
-          <w14:ligatures w14:val="none"/>
-        </w:rPr>
-        <w:t xml:space="preserve"> editing software such as Logic Pro, </w:t>
-      </w:r>
-      <w:r>
-        <w:rPr>
-          <w:rFonts w:eastAsia="Times New Roman"/>
-          <w:color w:val="auto"/>
-          <w:kern w:val="0"/>
-          <w14:ligatures w14:val="none"/>
-        </w:rPr>
-        <w:t xml:space="preserve">Davinci Resolve, Premiere Pro </w:t>
-      </w:r>
-      <w:r>
-        <w:rPr>
-          <w:rFonts w:eastAsia="Times New Roman"/>
-          <w:color w:val="auto"/>
-          <w:kern w:val="0"/>
-          <w14:ligatures w14:val="none"/>
-        </w:rPr>
-        <w:t>and Reaper.</w:t>
+        <w:t>Over 4 years of continuous experience using AV editing software such as Logic Pro, Davinci Resolve, Premiere Pro and Reaper.</w:t>
       </w:r>
     </w:p>
     <w:p>

</xml_diff>

<commit_message>
london, brompton and cv rejig
</commit_message>
<xml_diff>
--- a/downloads/cvs/DOCX/Arron Ware CV AV Broadcast Technician Mar26 .docx
+++ b/downloads/cvs/DOCX/Arron Ware CV AV Broadcast Technician Mar26 .docx
@@ -98,7 +98,43 @@
           <w:sz w:val="24"/>
           <w:szCs w:val="24"/>
         </w:rPr>
-        <w:t xml:space="preserve">keen to apply my skillset within the media sector. I have an extensive experience with production hardware and software from my time studying Music &amp; Sound Design at University. I have completed work experience with dock10’s MCR engineering team and worked for Manchester Basketball as event tech &amp; camera operator, where I enjoyed utilising my technical knowledge to aid productions whilst working alongside with a variety of people. </w:t>
+        <w:t xml:space="preserve">keen to apply my skillset within the media sector. I have an extensive experience with production hardware and software from my time studying Music &amp; Sound Design at University. </w:t>
+      </w:r>
+      <w:r>
+        <w:rPr>
+          <w:b w:val="false"/>
+          <w:bCs w:val="false"/>
+          <w:sz w:val="24"/>
+          <w:szCs w:val="24"/>
+        </w:rPr>
+        <w:t>I have been working freelance with Vinco Sports and Manchester Basketball</w:t>
+      </w:r>
+      <w:r>
+        <w:rPr>
+          <w:b w:val="false"/>
+          <w:bCs w:val="false"/>
+          <w:sz w:val="24"/>
+          <w:szCs w:val="24"/>
+        </w:rPr>
+        <w:t xml:space="preserve">, where I enjoyed utilising my technical knowledge to aid </w:t>
+      </w:r>
+      <w:r>
+        <w:rPr>
+          <w:b w:val="false"/>
+          <w:bCs w:val="false"/>
+          <w:sz w:val="24"/>
+          <w:szCs w:val="24"/>
+        </w:rPr>
+        <w:t xml:space="preserve">the </w:t>
+      </w:r>
+      <w:r>
+        <w:rPr>
+          <w:b w:val="false"/>
+          <w:bCs w:val="false"/>
+          <w:sz w:val="24"/>
+          <w:szCs w:val="24"/>
+        </w:rPr>
+        <w:t xml:space="preserve">productions whilst working alongside with a variety of people. </w:t>
       </w:r>
     </w:p>
     <w:p>
@@ -567,14 +603,43 @@
       </w:pPr>
       <w:r>
         <w:rPr/>
-        <w:t>03/26–Present</w:t>
+        <w:t>0</w:t>
+      </w:r>
+      <w:r>
+        <w:rPr/>
+        <w:t>5</w:t>
+      </w:r>
+      <w:r>
+        <w:rPr/>
+        <w:t>/26–Present</w:t>
       </w:r>
       <w:r>
         <w:rPr>
           <w:b/>
           <w:bCs/>
         </w:rPr>
-        <w:t xml:space="preserve"> Technical Operator (Internship) – Wavecast</w:t>
+        <w:t xml:space="preserve"> </w:t>
+      </w:r>
+      <w:r>
+        <w:rPr>
+          <w:b/>
+          <w:bCs/>
+        </w:rPr>
+        <w:t>Replay Operator</w:t>
+      </w:r>
+      <w:r>
+        <w:rPr>
+          <w:b/>
+          <w:bCs/>
+        </w:rPr>
+        <w:t xml:space="preserve"> – </w:t>
+      </w:r>
+      <w:r>
+        <w:rPr>
+          <w:b/>
+          <w:bCs/>
+        </w:rPr>
+        <w:t>Vinco Sports</w:t>
       </w:r>
     </w:p>
     <w:p>
@@ -593,7 +658,7 @@
       </w:pPr>
       <w:r>
         <w:rPr/>
-        <w:t>Remote vision mixing for clients based in the US &amp; UK, ensuring stable AV transmission and communicating with the client to ensure that they are happy throughout the broadcasting process, quickly resolving any technical difficulties during rehearsals beforehand.</w:t>
+        <w:t>Working with the graphic operator and vision mixer to coordinate the live production within the studio and the camera teams on site. Experience solving problems as they pop up during production.</w:t>
       </w:r>
     </w:p>
     <w:p>
@@ -642,6 +707,51 @@
         <w:pStyle w:val="Normal"/>
         <w:spacing w:lineRule="auto" w:line="259" w:before="0" w:after="142"/>
         <w:ind w:hanging="10" w:left="-5" w:right="0"/>
+        <w:rPr>
+          <w:b/>
+          <w:bCs/>
+        </w:rPr>
+      </w:pPr>
+      <w:r>
+        <w:rPr/>
+        <w:t>03/26–</w:t>
+      </w:r>
+      <w:r>
+        <w:rPr/>
+        <w:t>04/26</w:t>
+      </w:r>
+      <w:r>
+        <w:rPr>
+          <w:b/>
+          <w:bCs/>
+        </w:rPr>
+        <w:t xml:space="preserve"> Technical Operator (Internship) – Wavecast</w:t>
+      </w:r>
+    </w:p>
+    <w:p>
+      <w:pPr>
+        <w:pStyle w:val="Normal"/>
+        <w:numPr>
+          <w:ilvl w:val="0"/>
+          <w:numId w:val="2"/>
+        </w:numPr>
+        <w:suppressLineNumbers w:val="0"/>
+        <w:bidi w:val="0"/>
+        <w:spacing w:lineRule="auto" w:line="247" w:beforeAutospacing="0" w:before="0" w:afterAutospacing="0" w:after="266"/>
+        <w:ind w:hanging="360" w:left="705" w:right="0"/>
+        <w:jc w:val="left"/>
+        <w:rPr/>
+      </w:pPr>
+      <w:r>
+        <w:rPr/>
+        <w:t>Remote vision mixing for clients based in the US &amp; UK, ensuring stable AV transmission and communicating with the client to ensure that they are happy throughout the broadcasting process, quickly resolving any technical difficulties during rehearsals beforehand.</w:t>
+      </w:r>
+    </w:p>
+    <w:p>
+      <w:pPr>
+        <w:pStyle w:val="Normal"/>
+        <w:spacing w:lineRule="auto" w:line="259" w:before="0" w:after="142"/>
+        <w:ind w:hanging="10" w:left="-5" w:right="0"/>
         <w:rPr/>
       </w:pPr>
       <w:r>
@@ -717,7 +827,15 @@
       </w:pPr>
       <w:r>
         <w:rPr/>
-        <w:t>This internship focused primarily on technical support. As they were responsible for the entire port’s upkeep, it required me to be on call with dispatch which has furthered my confidence in communicating with specialised vocabulary whilst problem-solving.</w:t>
+        <w:t>This internship focused primarily on technical support. As they were responsible for the entire ports upkeep, it required me to be on call with dispatch which has furthered my confidence in communicating with specialised vocabulary wh</w:t>
+      </w:r>
+      <w:r>
+        <w:rPr/>
+        <w:t>en</w:t>
+      </w:r>
+      <w:r>
+        <w:rPr/>
+        <w:t xml:space="preserve"> problem-solving.</w:t>
       </w:r>
     </w:p>
     <w:p>
@@ -730,52 +848,6 @@
       <w:r>
         <w:rPr/>
         <w:t>ADDITIONAL EXPERIENCE</w:t>
-      </w:r>
-    </w:p>
-    <w:p>
-      <w:pPr>
-        <w:pStyle w:val="Normal"/>
-        <w:spacing w:lineRule="auto" w:line="259" w:before="0" w:after="142"/>
-        <w:ind w:hanging="10" w:left="-5" w:right="0"/>
-        <w:rPr>
-          <w:b/>
-          <w:bCs/>
-          <w:color w:val="auto"/>
-        </w:rPr>
-      </w:pPr>
-      <w:r>
-        <w:rPr>
-          <w:color w:val="auto"/>
-        </w:rPr>
-        <w:t>11/24–6/25</w:t>
-      </w:r>
-      <w:r>
-        <w:rPr>
-          <w:b/>
-          <w:bCs/>
-          <w:color w:val="auto"/>
-        </w:rPr>
-        <w:t xml:space="preserve"> Shop Assistant Volunteer - British Heart Foundation, Manchester Piccadilly</w:t>
-      </w:r>
-    </w:p>
-    <w:p>
-      <w:pPr>
-        <w:pStyle w:val="Normal"/>
-        <w:numPr>
-          <w:ilvl w:val="0"/>
-          <w:numId w:val="2"/>
-        </w:numPr>
-        <w:spacing w:before="0" w:after="266"/>
-        <w:ind w:hanging="360" w:left="705" w:right="0"/>
-        <w:rPr>
-          <w:color w:val="auto"/>
-        </w:rPr>
-      </w:pPr>
-      <w:r>
-        <w:rPr>
-          <w:color w:val="auto"/>
-        </w:rPr>
-        <w:t>I learned vital teamworking skills whilst helping a variety of different customers with their needs. I enjoyed meeting the different people who walked through the door.</w:t>
       </w:r>
     </w:p>
     <w:p>
@@ -878,7 +950,16 @@
           <w:kern w:val="0"/>
           <w14:ligatures w14:val="none"/>
         </w:rPr>
-        <w:t>I enjoy soldering/DIY electronics and using this to experiment with different sound design approaches and audio processing (similar to re-amping).</w:t>
+        <w:t xml:space="preserve">I enjoy soldering/DIY electronics </w:t>
+      </w:r>
+      <w:r>
+        <w:rPr>
+          <w:rFonts w:eastAsia="Times New Roman"/>
+          <w:color w:val="auto"/>
+          <w:kern w:val="0"/>
+          <w14:ligatures w14:val="none"/>
+        </w:rPr>
+        <w:t xml:space="preserve">to </w:t>
       </w:r>
     </w:p>
     <w:p>
@@ -914,28 +995,11 @@
     <w:p>
       <w:pPr>
         <w:pStyle w:val="Normal"/>
-        <w:ind w:hanging="0" w:left="0" w:right="0"/>
-        <w:rPr/>
-      </w:pPr>
-      <w:r>
-        <w:rPr/>
-      </w:r>
-    </w:p>
-    <w:p>
-      <w:pPr>
-        <w:pStyle w:val="Normal"/>
-        <w:spacing w:lineRule="auto" w:line="259" w:before="0" w:after="96"/>
-        <w:ind w:hanging="370" w:left="3250" w:right="0"/>
-        <w:rPr/>
-      </w:pPr>
-      <w:r>
-        <w:rPr/>
-      </w:r>
-    </w:p>
-    <w:p>
-      <w:pPr>
-        <w:pStyle w:val="Normal"/>
-        <w:ind w:hanging="370" w:left="3250" w:right="0"/>
+        <w:numPr>
+          <w:ilvl w:val="0"/>
+          <w:numId w:val="0"/>
+        </w:numPr>
+        <w:ind w:hanging="0" w:left="705" w:right="0"/>
         <w:rPr/>
       </w:pPr>
       <w:r>

</xml_diff>